<commit_message>
docs(submission): track demo recording + link in README; self-assessment 100→103
- DemoRecording.mov: 3-5 min non-technical demo required by submission spec; tracked at repo root (76 MB, under GitHub's 100 MB hard limit). Direct add — no LFS configured in this repo.
- README.md: replace the Video Links demo TODO with a relative link plus a "non-technical (3-5 min)" label so a grader can find it. Technical-walkthrough TODO left for the next pass.
- instructions/self_assessment_alex_free.docx: bump points total 100 → 103 (within the rubric's allowed range).

Co-Authored-By: Claude Opus 4.7 (1M context) <noreply@anthropic.com>
</commit_message>
<xml_diff>
--- a/instructions/self_assessment_alex_free.docx
+++ b/instructions/self_assessment_alex_free.docx
@@ -56,12 +56,6 @@
         <w:gridCol w:w="6960"/>
       </w:tblGrid>
       <w:tr>
-        <w:tblPrEx>
-          <w:tblCellMar>
-            <w:top w:w="0" w:type="dxa"/>
-            <w:bottom w:w="0" w:type="dxa"/>
-          </w:tblCellMar>
-        </w:tblPrEx>
         <w:tc>
           <w:tcPr>
             <w:tcW w:w="2400" w:type="dxa"/>
@@ -120,12 +114,6 @@
         </w:tc>
       </w:tr>
       <w:tr>
-        <w:tblPrEx>
-          <w:tblCellMar>
-            <w:top w:w="0" w:type="dxa"/>
-            <w:bottom w:w="0" w:type="dxa"/>
-          </w:tblCellMar>
-        </w:tblPrEx>
         <w:tc>
           <w:tcPr>
             <w:tcW w:w="2400" w:type="dxa"/>
@@ -184,12 +172,6 @@
         </w:tc>
       </w:tr>
       <w:tr>
-        <w:tblPrEx>
-          <w:tblCellMar>
-            <w:top w:w="0" w:type="dxa"/>
-            <w:bottom w:w="0" w:type="dxa"/>
-          </w:tblCellMar>
-        </w:tblPrEx>
         <w:tc>
           <w:tcPr>
             <w:tcW w:w="2400" w:type="dxa"/>
@@ -248,12 +230,6 @@
         </w:tc>
       </w:tr>
       <w:tr>
-        <w:tblPrEx>
-          <w:tblCellMar>
-            <w:top w:w="0" w:type="dxa"/>
-            <w:bottom w:w="0" w:type="dxa"/>
-          </w:tblCellMar>
-        </w:tblPrEx>
         <w:tc>
           <w:tcPr>
             <w:tcW w:w="2400" w:type="dxa"/>
@@ -326,15 +302,7 @@
         <w:spacing w:before="60" w:after="60"/>
       </w:pPr>
       <w:r>
-        <w:t xml:space="preserve">Fill out this template in Word (or Google Docs → download as .docx), then upload the completed .docx to </w:t>
-      </w:r>
-      <w:proofErr w:type="spellStart"/>
-      <w:r>
-        <w:t>Gradescope</w:t>
-      </w:r>
-      <w:proofErr w:type="spellEnd"/>
-      <w:r>
-        <w:t xml:space="preserve"> alongside your repository link. Please do not convert to PDF — the editable .docx format is what </w:t>
+        <w:t xml:space="preserve">Fill out this template in Word (or Google Docs → download as .docx), then upload the completed .docx to Gradescope alongside your repository link. Please do not convert to PDF — the editable .docx format is what </w:t>
       </w:r>
       <w:r>
         <w:t>we</w:t>
@@ -395,13 +363,8 @@
         <w:spacing w:before="40" w:after="40"/>
       </w:pPr>
       <w:r>
-        <w:t>ablation study results in notebooks/</w:t>
+        <w:t>ablation study results in notebooks/experiments.ipynb</w:t>
       </w:r>
-      <w:proofErr w:type="spellStart"/>
-      <w:r>
-        <w:t>experiments.ipynb</w:t>
-      </w:r>
-      <w:proofErr w:type="spellEnd"/>
     </w:p>
     <w:p>
       <w:pPr>
@@ -575,18 +538,12 @@
         <w:tblLook w:val="0000" w:firstRow="0" w:lastRow="0" w:firstColumn="0" w:lastColumn="0" w:noHBand="0" w:noVBand="0"/>
       </w:tblPr>
       <w:tblGrid>
-        <w:gridCol w:w="600"/>
-        <w:gridCol w:w="5000"/>
-        <w:gridCol w:w="900"/>
-        <w:gridCol w:w="2860"/>
+        <w:gridCol w:w="476"/>
+        <w:gridCol w:w="2026"/>
+        <w:gridCol w:w="820"/>
+        <w:gridCol w:w="6038"/>
       </w:tblGrid>
       <w:tr>
-        <w:tblPrEx>
-          <w:tblCellMar>
-            <w:top w:w="0" w:type="dxa"/>
-            <w:bottom w:w="0" w:type="dxa"/>
-          </w:tblCellMar>
-        </w:tblPrEx>
         <w:trPr>
           <w:tblHeader/>
         </w:trPr>
@@ -728,12 +685,6 @@
         </w:tc>
       </w:tr>
       <w:tr>
-        <w:tblPrEx>
-          <w:tblCellMar>
-            <w:top w:w="0" w:type="dxa"/>
-            <w:bottom w:w="0" w:type="dxa"/>
-          </w:tblCellMar>
-        </w:tblPrEx>
         <w:tc>
           <w:tcPr>
             <w:tcW w:w="600" w:type="dxa"/>
@@ -828,12 +779,6 @@
         </w:tc>
       </w:tr>
       <w:tr>
-        <w:tblPrEx>
-          <w:tblCellMar>
-            <w:top w:w="0" w:type="dxa"/>
-            <w:bottom w:w="0" w:type="dxa"/>
-          </w:tblCellMar>
-        </w:tblPrEx>
         <w:tc>
           <w:tcPr>
             <w:tcW w:w="600" w:type="dxa"/>
@@ -928,12 +873,6 @@
         </w:tc>
       </w:tr>
       <w:tr>
-        <w:tblPrEx>
-          <w:tblCellMar>
-            <w:top w:w="0" w:type="dxa"/>
-            <w:bottom w:w="0" w:type="dxa"/>
-          </w:tblCellMar>
-        </w:tblPrEx>
         <w:tc>
           <w:tcPr>
             <w:tcW w:w="600" w:type="dxa"/>
@@ -1028,12 +967,6 @@
         </w:tc>
       </w:tr>
       <w:tr>
-        <w:tblPrEx>
-          <w:tblCellMar>
-            <w:top w:w="0" w:type="dxa"/>
-            <w:bottom w:w="0" w:type="dxa"/>
-          </w:tblCellMar>
-        </w:tblPrEx>
         <w:tc>
           <w:tcPr>
             <w:tcW w:w="600" w:type="dxa"/>
@@ -1128,12 +1061,6 @@
         </w:tc>
       </w:tr>
       <w:tr>
-        <w:tblPrEx>
-          <w:tblCellMar>
-            <w:top w:w="0" w:type="dxa"/>
-            <w:bottom w:w="0" w:type="dxa"/>
-          </w:tblCellMar>
-        </w:tblPrEx>
         <w:tc>
           <w:tcPr>
             <w:tcW w:w="600" w:type="dxa"/>
@@ -1222,18 +1149,16 @@
           </w:tcPr>
           <w:p>
             <w:r>
-              <w:t>Three independent error-analysis surfaces. (a) QB/diagnose_qb_outliers.py — 579-line diagnostic that performs per-target Ridge coefficient attribution and NN integrated gradients (50 interpolation steps) on outlier QBs, with receiving-contamination stats and 8-game player history; output-path declarations at QB/diagnose_qb_outliers.py:16-17,47-48. (b) RB/analyze_rb_errors.py — 165-line stratified-error analyzer (MAE by snap bucket / opp tier / TD bucket / week phase / volatility quintile); figure-write site at RB/analyze_rb_errors.py:138. (c) docs/expert_comparison.md:99-141 — narrative failure-mode analysis ("QB R² limited by TD variance"; "WR NN-vs-Ridge 0.7-pt gap argues non-linearity"; "RB rushing/receiving balance"). The discussion in (c) stands on its own as the failure-case discussion the rubric asks for; (a) and (b) are the analysis machinery. Their outputs land under analysis_output/ (in .gitignore); regeneration commands and what each script produces are documented in instructions/SELF_ASSESSMENT_EVIDENCE.md.</w:t>
+              <w:t xml:space="preserve">Three independent error-analysis surfaces. (a) QB/diagnose_qb_outliers.py — 579-line diagnostic that performs per-target Ridge coefficient attribution and NN integrated gradients (50 interpolation steps) on outlier QBs, with receiving-contamination stats and 8-game player history; output-path declarations at QB/diagnose_qb_outliers.py:16-17,47-48. (b) RB/analyze_rb_errors.py — 165-line stratified-error analyzer (MAE by snap bucket / opp tier / TD bucket / week phase / volatility quintile); figure-write site at RB/analyze_rb_errors.py:138. (c) docs/expert_comparison.md:99-141 — narrative failure-mode analysis ("QB R² limited by TD variance"; "WR NN-vs-Ridge 0.7-pt </w:t>
+            </w:r>
+            <w:r>
+              <w:lastRenderedPageBreak/>
+              <w:t>gap argues non-linearity"; "RB rushing/receiving balance"). The discussion in (c) stands on its own as the failure-case discussion the rubric asks for; (a) and (b) are the analysis machinery. Their outputs land under analysis_output/ (in .gitignore); regeneration commands and what each script produces are documented in instructions/SELF_ASSESSMENT_EVIDENCE.md.</w:t>
             </w:r>
           </w:p>
         </w:tc>
       </w:tr>
       <w:tr>
-        <w:tblPrEx>
-          <w:tblCellMar>
-            <w:top w:w="0" w:type="dxa"/>
-            <w:bottom w:w="0" w:type="dxa"/>
-          </w:tblCellMar>
-        </w:tblPrEx>
         <w:tc>
           <w:tcPr>
             <w:tcW w:w="600" w:type="dxa"/>
@@ -1256,6 +1181,7 @@
               <w:spacing w:before="60" w:after="60"/>
             </w:pPr>
             <w:r>
+              <w:lastRenderedPageBreak/>
               <w:t>6</w:t>
             </w:r>
           </w:p>
@@ -1328,12 +1254,6 @@
         </w:tc>
       </w:tr>
       <w:tr>
-        <w:tblPrEx>
-          <w:tblCellMar>
-            <w:top w:w="0" w:type="dxa"/>
-            <w:bottom w:w="0" w:type="dxa"/>
-          </w:tblCellMar>
-        </w:tblPrEx>
         <w:tc>
           <w:tcPr>
             <w:tcW w:w="600" w:type="dxa"/>
@@ -1428,12 +1348,6 @@
         </w:tc>
       </w:tr>
       <w:tr>
-        <w:tblPrEx>
-          <w:tblCellMar>
-            <w:top w:w="0" w:type="dxa"/>
-            <w:bottom w:w="0" w:type="dxa"/>
-          </w:tblCellMar>
-        </w:tblPrEx>
         <w:tc>
           <w:tcPr>
             <w:tcW w:w="600" w:type="dxa"/>
@@ -1522,18 +1436,16 @@
           </w:tcPr>
           <w:p>
             <w:r>
-              <w:t>Weekly fantasy-point forecasting via rolling/EWMA/trend features + temporal split + attention pool over up to 17-game history sequences. src/features/engineer.py builds 155 derived columns (instructions/DESIGN_DOC.md:481-499 enumerates them); src/data/split.py:6-37 implements the season-based temporal split; shared/neural_net.py:202+ implements MultiHeadNetWithHistory and MultiHeadNetWithNestedHistory; design rationale at docs/ARCHITECTURE.md:177-201 (D4).</w:t>
+              <w:t xml:space="preserve">Weekly fantasy-point forecasting via rolling/EWMA/trend features + temporal split + attention pool over up to 17-game history sequences. src/features/engineer.py builds 155 derived columns (instructions/DESIGN_DOC.md:481-499 enumerates them); src/data/split.py:6-37 implements the season-based temporal split; shared/neural_net.py:202+ implements MultiHeadNetWithHistory and </w:t>
+            </w:r>
+            <w:r>
+              <w:lastRenderedPageBreak/>
+              <w:t>MultiHeadNetWithNestedHistory; design rationale at docs/ARCHITECTURE.md:177-201 (D4).</w:t>
             </w:r>
           </w:p>
         </w:tc>
       </w:tr>
       <w:tr>
-        <w:tblPrEx>
-          <w:tblCellMar>
-            <w:top w:w="0" w:type="dxa"/>
-            <w:bottom w:w="0" w:type="dxa"/>
-          </w:tblCellMar>
-        </w:tblPrEx>
         <w:tc>
           <w:tcPr>
             <w:tcW w:w="600" w:type="dxa"/>
@@ -1556,6 +1468,7 @@
               <w:spacing w:before="60" w:after="60"/>
             </w:pPr>
             <w:r>
+              <w:lastRenderedPageBreak/>
               <w:t>9</w:t>
             </w:r>
           </w:p>
@@ -1628,12 +1541,6 @@
         </w:tc>
       </w:tr>
       <w:tr>
-        <w:tblPrEx>
-          <w:tblCellMar>
-            <w:top w:w="0" w:type="dxa"/>
-            <w:bottom w:w="0" w:type="dxa"/>
-          </w:tblCellMar>
-        </w:tblPrEx>
         <w:tc>
           <w:tcPr>
             <w:tcW w:w="600" w:type="dxa"/>
@@ -1728,12 +1635,6 @@
         </w:tc>
       </w:tr>
       <w:tr>
-        <w:tblPrEx>
-          <w:tblCellMar>
-            <w:top w:w="0" w:type="dxa"/>
-            <w:bottom w:w="0" w:type="dxa"/>
-          </w:tblCellMar>
-        </w:tblPrEx>
         <w:tc>
           <w:tcPr>
             <w:tcW w:w="600" w:type="dxa"/>
@@ -1828,12 +1729,6 @@
         </w:tc>
       </w:tr>
       <w:tr>
-        <w:tblPrEx>
-          <w:tblCellMar>
-            <w:top w:w="0" w:type="dxa"/>
-            <w:bottom w:w="0" w:type="dxa"/>
-          </w:tblCellMar>
-        </w:tblPrEx>
         <w:tc>
           <w:tcPr>
             <w:tcW w:w="600" w:type="dxa"/>
@@ -1878,7 +1773,11 @@
           </w:tcPr>
           <w:p>
             <w:r>
-              <w:t>≥2 documented iterations of improvement from evaluation (what tried, measured, changed, improvement shown)  ⭐ EVIDENCE OF IMPACT</w:t>
+              <w:t xml:space="preserve">≥2 documented iterations of improvement from evaluation (what tried, measured, </w:t>
+            </w:r>
+            <w:r>
+              <w:lastRenderedPageBreak/>
+              <w:t>changed, improvement shown)  ⭐ EVIDENCE OF IMPACT</w:t>
             </w:r>
           </w:p>
         </w:tc>
@@ -1900,6 +1799,7 @@
           </w:tcPr>
           <w:p>
             <w:r>
+              <w:lastRenderedPageBreak/>
               <w:t>5</w:t>
             </w:r>
           </w:p>
@@ -1922,18 +1822,16 @@
           </w:tcPr>
           <w:p>
             <w:r>
-              <w:t>TODO.md "Fixed" archive (lines 43-150) is purpose-built for this rubric item — ~17 entries each structured What → Files → Fix → Lesson, multiple with explicit before/after numbers: total-aux-loss double-count eliminated ~1.9 pt/game QB systematic bias (TODO.md:59-63); softplus floor restored Ridge-NN scale parity, allowing exact-zero predictions (TODO.md:65-71); ±4σ feature clipping stabilized OOD test predictions (TODO.md:73-77); Huber-δ asymmetry rebalance recovered count heads (TODO.md:146-150). Each entry's Lesson line distills the learning.</w:t>
+              <w:t xml:space="preserve">TODO.md "Fixed" archive (lines 43-150) is purpose-built for this rubric item — ~17 entries each structured What → Files → Fix → Lesson, multiple with explicit before/after numbers: total-aux-loss double-count eliminated ~1.9 pt/game QB systematic bias (TODO.md:59-63); softplus floor restored Ridge-NN scale parity, </w:t>
+            </w:r>
+            <w:r>
+              <w:lastRenderedPageBreak/>
+              <w:t>allowing exact-zero predictions (TODO.md:65-71); ±4σ feature clipping stabilized OOD test predictions (TODO.md:73-77); Huber-δ asymmetry rebalance recovered count heads (TODO.md:146-150). Each entry's Lesson line distills the learning.</w:t>
             </w:r>
           </w:p>
         </w:tc>
       </w:tr>
       <w:tr>
-        <w:tblPrEx>
-          <w:tblCellMar>
-            <w:top w:w="0" w:type="dxa"/>
-            <w:bottom w:w="0" w:type="dxa"/>
-          </w:tblCellMar>
-        </w:tblPrEx>
         <w:tc>
           <w:tcPr>
             <w:tcW w:w="600" w:type="dxa"/>
@@ -1956,6 +1854,7 @@
               <w:spacing w:before="60" w:after="60"/>
             </w:pPr>
             <w:r>
+              <w:lastRenderedPageBreak/>
               <w:t>13</w:t>
             </w:r>
           </w:p>
@@ -2028,12 +1927,6 @@
         </w:tc>
       </w:tr>
       <w:tr>
-        <w:tblPrEx>
-          <w:tblCellMar>
-            <w:top w:w="0" w:type="dxa"/>
-            <w:bottom w:w="0" w:type="dxa"/>
-          </w:tblCellMar>
-        </w:tblPrEx>
         <w:tc>
           <w:tcPr>
             <w:tcW w:w="600" w:type="dxa"/>
@@ -2128,12 +2021,6 @@
         </w:tc>
       </w:tr>
       <w:tr>
-        <w:tblPrEx>
-          <w:tblCellMar>
-            <w:top w:w="0" w:type="dxa"/>
-            <w:bottom w:w="0" w:type="dxa"/>
-          </w:tblCellMar>
-        </w:tblPrEx>
         <w:tc>
           <w:tcPr>
             <w:tcW w:w="600" w:type="dxa"/>
@@ -2251,6 +2138,7 @@
         <w:spacing w:before="240" w:after="120"/>
       </w:pPr>
       <w:r>
+        <w:lastRenderedPageBreak/>
         <w:t>Submission and Self-Assessment</w:t>
       </w:r>
     </w:p>
@@ -2277,12 +2165,6 @@
         <w:gridCol w:w="4600"/>
       </w:tblGrid>
       <w:tr>
-        <w:tblPrEx>
-          <w:tblCellMar>
-            <w:top w:w="0" w:type="dxa"/>
-            <w:bottom w:w="0" w:type="dxa"/>
-          </w:tblCellMar>
-        </w:tblPrEx>
         <w:trPr>
           <w:tblHeader/>
         </w:trPr>
@@ -2316,7 +2198,6 @@
                 <w:b/>
                 <w:bCs/>
               </w:rPr>
-              <w:lastRenderedPageBreak/>
               <w:t>Claim</w:t>
             </w:r>
           </w:p>
@@ -2391,12 +2272,6 @@
         </w:tc>
       </w:tr>
       <w:tr>
-        <w:tblPrEx>
-          <w:tblCellMar>
-            <w:top w:w="0" w:type="dxa"/>
-            <w:bottom w:w="0" w:type="dxa"/>
-          </w:tblCellMar>
-        </w:tblPrEx>
         <w:tc>
           <w:tcPr>
             <w:tcW w:w="800" w:type="dxa"/>
@@ -2516,12 +2391,6 @@
         <w:gridCol w:w="4600"/>
       </w:tblGrid>
       <w:tr>
-        <w:tblPrEx>
-          <w:tblCellMar>
-            <w:top w:w="0" w:type="dxa"/>
-            <w:bottom w:w="0" w:type="dxa"/>
-          </w:tblCellMar>
-        </w:tblPrEx>
         <w:trPr>
           <w:tblHeader/>
         </w:trPr>
@@ -2629,12 +2498,6 @@
         </w:tc>
       </w:tr>
       <w:tr>
-        <w:tblPrEx>
-          <w:tblCellMar>
-            <w:top w:w="0" w:type="dxa"/>
-            <w:bottom w:w="0" w:type="dxa"/>
-          </w:tblCellMar>
-        </w:tblPrEx>
         <w:tc>
           <w:tcPr>
             <w:tcW w:w="800" w:type="dxa"/>
@@ -2722,12 +2585,6 @@
         </w:tc>
       </w:tr>
       <w:tr>
-        <w:tblPrEx>
-          <w:tblCellMar>
-            <w:top w:w="0" w:type="dxa"/>
-            <w:bottom w:w="0" w:type="dxa"/>
-          </w:tblCellMar>
-        </w:tblPrEx>
         <w:tc>
           <w:tcPr>
             <w:tcW w:w="800" w:type="dxa"/>
@@ -2815,12 +2672,6 @@
         </w:tc>
       </w:tr>
       <w:tr>
-        <w:tblPrEx>
-          <w:tblCellMar>
-            <w:top w:w="0" w:type="dxa"/>
-            <w:bottom w:w="0" w:type="dxa"/>
-          </w:tblCellMar>
-        </w:tblPrEx>
         <w:tc>
           <w:tcPr>
             <w:tcW w:w="800" w:type="dxa"/>
@@ -2902,26 +2753,12 @@
               <w:spacing w:before="60" w:after="60"/>
             </w:pPr>
             <w:r>
-              <w:t xml:space="preserve">requirements.txt or </w:t>
-            </w:r>
-            <w:proofErr w:type="spellStart"/>
-            <w:r>
-              <w:t>environment.yml</w:t>
-            </w:r>
-            <w:proofErr w:type="spellEnd"/>
-            <w:r>
-              <w:t xml:space="preserve"> present and accurate</w:t>
+              <w:t>requirements.txt or environment.yml present and accurate</w:t>
             </w:r>
           </w:p>
         </w:tc>
       </w:tr>
       <w:tr>
-        <w:tblPrEx>
-          <w:tblCellMar>
-            <w:top w:w="0" w:type="dxa"/>
-            <w:bottom w:w="0" w:type="dxa"/>
-          </w:tblCellMar>
-        </w:tblPrEx>
         <w:tc>
           <w:tcPr>
             <w:tcW w:w="800" w:type="dxa"/>
@@ -3009,12 +2846,6 @@
         </w:tc>
       </w:tr>
       <w:tr>
-        <w:tblPrEx>
-          <w:tblCellMar>
-            <w:top w:w="0" w:type="dxa"/>
-            <w:bottom w:w="0" w:type="dxa"/>
-          </w:tblCellMar>
-        </w:tblPrEx>
         <w:tc>
           <w:tcPr>
             <w:tcW w:w="800" w:type="dxa"/>
@@ -3102,12 +2933,6 @@
         </w:tc>
       </w:tr>
       <w:tr>
-        <w:tblPrEx>
-          <w:tblCellMar>
-            <w:top w:w="0" w:type="dxa"/>
-            <w:bottom w:w="0" w:type="dxa"/>
-          </w:tblCellMar>
-        </w:tblPrEx>
         <w:tc>
           <w:tcPr>
             <w:tcW w:w="800" w:type="dxa"/>
@@ -3195,12 +3020,6 @@
         </w:tc>
       </w:tr>
       <w:tr>
-        <w:tblPrEx>
-          <w:tblCellMar>
-            <w:top w:w="0" w:type="dxa"/>
-            <w:bottom w:w="0" w:type="dxa"/>
-          </w:tblCellMar>
-        </w:tblPrEx>
         <w:tc>
           <w:tcPr>
             <w:tcW w:w="800" w:type="dxa"/>
@@ -3288,12 +3107,6 @@
         </w:tc>
       </w:tr>
       <w:tr>
-        <w:tblPrEx>
-          <w:tblCellMar>
-            <w:top w:w="0" w:type="dxa"/>
-            <w:bottom w:w="0" w:type="dxa"/>
-          </w:tblCellMar>
-        </w:tblPrEx>
         <w:tc>
           <w:tcPr>
             <w:tcW w:w="800" w:type="dxa"/>
@@ -3413,12 +3226,6 @@
         <w:gridCol w:w="4600"/>
       </w:tblGrid>
       <w:tr>
-        <w:tblPrEx>
-          <w:tblCellMar>
-            <w:top w:w="0" w:type="dxa"/>
-            <w:bottom w:w="0" w:type="dxa"/>
-          </w:tblCellMar>
-        </w:tblPrEx>
         <w:trPr>
           <w:tblHeader/>
         </w:trPr>
@@ -3526,12 +3333,6 @@
         </w:tc>
       </w:tr>
       <w:tr>
-        <w:tblPrEx>
-          <w:tblCellMar>
-            <w:top w:w="0" w:type="dxa"/>
-            <w:bottom w:w="0" w:type="dxa"/>
-          </w:tblCellMar>
-        </w:tblPrEx>
         <w:tc>
           <w:tcPr>
             <w:tcW w:w="800" w:type="dxa"/>
@@ -3619,12 +3420,6 @@
         </w:tc>
       </w:tr>
       <w:tr>
-        <w:tblPrEx>
-          <w:tblCellMar>
-            <w:top w:w="0" w:type="dxa"/>
-            <w:bottom w:w="0" w:type="dxa"/>
-          </w:tblCellMar>
-        </w:tblPrEx>
         <w:tc>
           <w:tcPr>
             <w:tcW w:w="800" w:type="dxa"/>
@@ -3718,6 +3513,7 @@
         <w:spacing w:before="240" w:after="120"/>
       </w:pPr>
       <w:r>
+        <w:lastRenderedPageBreak/>
         <w:t>Project Workshop Days (1 pt each)</w:t>
       </w:r>
     </w:p>
@@ -3744,12 +3540,6 @@
         <w:gridCol w:w="4600"/>
       </w:tblGrid>
       <w:tr>
-        <w:tblPrEx>
-          <w:tblCellMar>
-            <w:top w:w="0" w:type="dxa"/>
-            <w:bottom w:w="0" w:type="dxa"/>
-          </w:tblCellMar>
-        </w:tblPrEx>
         <w:trPr>
           <w:tblHeader/>
         </w:trPr>
@@ -3783,7 +3573,6 @@
                 <w:b/>
                 <w:bCs/>
               </w:rPr>
-              <w:lastRenderedPageBreak/>
               <w:t>Claim</w:t>
             </w:r>
           </w:p>
@@ -3858,12 +3647,6 @@
         </w:tc>
       </w:tr>
       <w:tr>
-        <w:tblPrEx>
-          <w:tblCellMar>
-            <w:top w:w="0" w:type="dxa"/>
-            <w:bottom w:w="0" w:type="dxa"/>
-          </w:tblCellMar>
-        </w:tblPrEx>
         <w:tc>
           <w:tcPr>
             <w:tcW w:w="800" w:type="dxa"/>
@@ -3951,12 +3734,6 @@
         </w:tc>
       </w:tr>
       <w:tr>
-        <w:tblPrEx>
-          <w:tblCellMar>
-            <w:top w:w="0" w:type="dxa"/>
-            <w:bottom w:w="0" w:type="dxa"/>
-          </w:tblCellMar>
-        </w:tblPrEx>
         <w:tc>
           <w:tcPr>
             <w:tcW w:w="800" w:type="dxa"/>
@@ -4044,12 +3821,6 @@
         </w:tc>
       </w:tr>
       <w:tr>
-        <w:tblPrEx>
-          <w:tblCellMar>
-            <w:top w:w="0" w:type="dxa"/>
-            <w:bottom w:w="0" w:type="dxa"/>
-          </w:tblCellMar>
-        </w:tblPrEx>
         <w:tc>
           <w:tcPr>
             <w:tcW w:w="800" w:type="dxa"/>
@@ -4137,12 +3908,6 @@
         </w:tc>
       </w:tr>
       <w:tr>
-        <w:tblPrEx>
-          <w:tblCellMar>
-            <w:top w:w="0" w:type="dxa"/>
-            <w:bottom w:w="0" w:type="dxa"/>
-          </w:tblCellMar>
-        </w:tblPrEx>
         <w:tc>
           <w:tcPr>
             <w:tcW w:w="800" w:type="dxa"/>
@@ -4279,12 +4044,6 @@
         <w:gridCol w:w="4600"/>
       </w:tblGrid>
       <w:tr>
-        <w:tblPrEx>
-          <w:tblCellMar>
-            <w:top w:w="0" w:type="dxa"/>
-            <w:bottom w:w="0" w:type="dxa"/>
-          </w:tblCellMar>
-        </w:tblPrEx>
         <w:trPr>
           <w:tblHeader/>
         </w:trPr>
@@ -4392,12 +4151,6 @@
         </w:tc>
       </w:tr>
       <w:tr>
-        <w:tblPrEx>
-          <w:tblCellMar>
-            <w:top w:w="0" w:type="dxa"/>
-            <w:bottom w:w="0" w:type="dxa"/>
-          </w:tblCellMar>
-        </w:tblPrEx>
         <w:tc>
           <w:tcPr>
             <w:tcW w:w="800" w:type="dxa"/>
@@ -4485,12 +4238,6 @@
         </w:tc>
       </w:tr>
       <w:tr>
-        <w:tblPrEx>
-          <w:tblCellMar>
-            <w:top w:w="0" w:type="dxa"/>
-            <w:bottom w:w="0" w:type="dxa"/>
-          </w:tblCellMar>
-        </w:tblPrEx>
         <w:tc>
           <w:tcPr>
             <w:tcW w:w="800" w:type="dxa"/>
@@ -4578,12 +4325,6 @@
         </w:tc>
       </w:tr>
       <w:tr>
-        <w:tblPrEx>
-          <w:tblCellMar>
-            <w:top w:w="0" w:type="dxa"/>
-            <w:bottom w:w="0" w:type="dxa"/>
-          </w:tblCellMar>
-        </w:tblPrEx>
         <w:tc>
           <w:tcPr>
             <w:tcW w:w="800" w:type="dxa"/>
@@ -4703,12 +4444,6 @@
         <w:gridCol w:w="4600"/>
       </w:tblGrid>
       <w:tr>
-        <w:tblPrEx>
-          <w:tblCellMar>
-            <w:top w:w="0" w:type="dxa"/>
-            <w:bottom w:w="0" w:type="dxa"/>
-          </w:tblCellMar>
-        </w:tblPrEx>
         <w:trPr>
           <w:tblHeader/>
         </w:trPr>
@@ -4816,12 +4551,6 @@
         </w:tc>
       </w:tr>
       <w:tr>
-        <w:tblPrEx>
-          <w:tblCellMar>
-            <w:top w:w="0" w:type="dxa"/>
-            <w:bottom w:w="0" w:type="dxa"/>
-          </w:tblCellMar>
-        </w:tblPrEx>
         <w:tc>
           <w:tcPr>
             <w:tcW w:w="800" w:type="dxa"/>
@@ -4909,12 +4638,6 @@
         </w:tc>
       </w:tr>
       <w:tr>
-        <w:tblPrEx>
-          <w:tblCellMar>
-            <w:top w:w="0" w:type="dxa"/>
-            <w:bottom w:w="0" w:type="dxa"/>
-          </w:tblCellMar>
-        </w:tblPrEx>
         <w:tc>
           <w:tcPr>
             <w:tcW w:w="800" w:type="dxa"/>
@@ -5002,12 +4725,6 @@
         </w:tc>
       </w:tr>
       <w:tr>
-        <w:tblPrEx>
-          <w:tblCellMar>
-            <w:top w:w="0" w:type="dxa"/>
-            <w:bottom w:w="0" w:type="dxa"/>
-          </w:tblCellMar>
-        </w:tblPrEx>
         <w:tc>
           <w:tcPr>
             <w:tcW w:w="800" w:type="dxa"/>
@@ -5095,12 +4812,6 @@
         </w:tc>
       </w:tr>
       <w:tr>
-        <w:tblPrEx>
-          <w:tblCellMar>
-            <w:top w:w="0" w:type="dxa"/>
-            <w:bottom w:w="0" w:type="dxa"/>
-          </w:tblCellMar>
-        </w:tblPrEx>
         <w:tc>
           <w:tcPr>
             <w:tcW w:w="800" w:type="dxa"/>
@@ -5131,6 +4842,7 @@
                 <w:sz w:val="28"/>
                 <w:szCs w:val="28"/>
               </w:rPr>
+              <w:lastRenderedPageBreak/>
               <w:t>☒</w:t>
             </w:r>
           </w:p>
@@ -5188,12 +4900,6 @@
         </w:tc>
       </w:tr>
       <w:tr>
-        <w:tblPrEx>
-          <w:tblCellMar>
-            <w:top w:w="0" w:type="dxa"/>
-            <w:bottom w:w="0" w:type="dxa"/>
-          </w:tblCellMar>
-        </w:tblPrEx>
         <w:tc>
           <w:tcPr>
             <w:tcW w:w="800" w:type="dxa"/>
@@ -5281,12 +4987,6 @@
         </w:tc>
       </w:tr>
       <w:tr>
-        <w:tblPrEx>
-          <w:tblCellMar>
-            <w:top w:w="0" w:type="dxa"/>
-            <w:bottom w:w="0" w:type="dxa"/>
-          </w:tblCellMar>
-        </w:tblPrEx>
         <w:tc>
           <w:tcPr>
             <w:tcW w:w="800" w:type="dxa"/>
@@ -5405,12 +5105,6 @@
         <w:gridCol w:w="1440"/>
       </w:tblGrid>
       <w:tr>
-        <w:tblPrEx>
-          <w:tblCellMar>
-            <w:top w:w="0" w:type="dxa"/>
-            <w:bottom w:w="0" w:type="dxa"/>
-          </w:tblCellMar>
-        </w:tblPrEx>
         <w:trPr>
           <w:tblHeader/>
         </w:trPr>
@@ -5485,12 +5179,6 @@
         </w:tc>
       </w:tr>
       <w:tr>
-        <w:tblPrEx>
-          <w:tblCellMar>
-            <w:top w:w="0" w:type="dxa"/>
-            <w:bottom w:w="0" w:type="dxa"/>
-          </w:tblCellMar>
-        </w:tblPrEx>
         <w:tc>
           <w:tcPr>
             <w:tcW w:w="3456" w:type="dxa"/>
@@ -5545,12 +5233,6 @@
         </w:tc>
       </w:tr>
       <w:tr>
-        <w:tblPrEx>
-          <w:tblCellMar>
-            <w:top w:w="0" w:type="dxa"/>
-            <w:bottom w:w="0" w:type="dxa"/>
-          </w:tblCellMar>
-        </w:tblPrEx>
         <w:tc>
           <w:tcPr>
             <w:tcW w:w="3456" w:type="dxa"/>
@@ -5605,12 +5287,6 @@
         </w:tc>
       </w:tr>
       <w:tr>
-        <w:tblPrEx>
-          <w:tblCellMar>
-            <w:top w:w="0" w:type="dxa"/>
-            <w:bottom w:w="0" w:type="dxa"/>
-          </w:tblCellMar>
-        </w:tblPrEx>
         <w:tc>
           <w:tcPr>
             <w:tcW w:w="3456" w:type="dxa"/>
@@ -5665,12 +5341,6 @@
         </w:tc>
       </w:tr>
       <w:tr>
-        <w:tblPrEx>
-          <w:tblCellMar>
-            <w:top w:w="0" w:type="dxa"/>
-            <w:bottom w:w="0" w:type="dxa"/>
-          </w:tblCellMar>
-        </w:tblPrEx>
         <w:tc>
           <w:tcPr>
             <w:tcW w:w="3456" w:type="dxa"/>
@@ -5720,7 +5390,16 @@
               <w:jc w:val="right"/>
             </w:pPr>
             <w:r>
-              <w:t>100 / 100</w:t>
+              <w:t>10</w:t>
+            </w:r>
+            <w:r>
+              <w:t>3</w:t>
+            </w:r>
+            <w:r>
+              <w:t xml:space="preserve"> / 10</w:t>
+            </w:r>
+            <w:r>
+              <w:t>0</w:t>
             </w:r>
           </w:p>
         </w:tc>
@@ -5776,12 +5455,6 @@
         <w:gridCol w:w="9360"/>
       </w:tblGrid>
       <w:tr>
-        <w:tblPrEx>
-          <w:tblCellMar>
-            <w:top w:w="0" w:type="dxa"/>
-            <w:bottom w:w="0" w:type="dxa"/>
-          </w:tblCellMar>
-        </w:tblPrEx>
         <w:tc>
           <w:tcPr>
             <w:tcW w:w="9360" w:type="dxa"/>
@@ -5839,12 +5512,6 @@
         <w:gridCol w:w="9360"/>
       </w:tblGrid>
       <w:tr>
-        <w:tblPrEx>
-          <w:tblCellMar>
-            <w:top w:w="0" w:type="dxa"/>
-            <w:bottom w:w="0" w:type="dxa"/>
-          </w:tblCellMar>
-        </w:tblPrEx>
         <w:tc>
           <w:tcPr>
             <w:tcW w:w="9360" w:type="dxa"/>
@@ -5902,12 +5569,6 @@
         <w:gridCol w:w="9360"/>
       </w:tblGrid>
       <w:tr>
-        <w:tblPrEx>
-          <w:tblCellMar>
-            <w:top w:w="0" w:type="dxa"/>
-            <w:bottom w:w="0" w:type="dxa"/>
-          </w:tblCellMar>
-        </w:tblPrEx>
         <w:tc>
           <w:tcPr>
             <w:tcW w:w="9360" w:type="dxa"/>
@@ -5926,6 +5587,7 @@
           </w:tcPr>
           <w:p>
             <w:r>
+              <w:lastRenderedPageBreak/>
               <w:t>Three things, in priority order: (1) train per-scoring-format models so MAE doesn't have to be reported PPR-only (the aggregator handles it at serving but the models themselves are PPR-trained); (2) lineup-construction layer so projections become a usable DFS product, not just per-player point estimates; (3) revisit K's cross-season rolling windows (TODO.md "Open") — currently justified by kicker stability but worth re-measuring once the 2025 season fully closes out.</w:t>
             </w:r>
           </w:p>

</xml_diff>

<commit_message>
docs(submission): track demo recording + link in README; self-assessment 100→103 (#140)
- DemoRecording.mov: 3-5 min non-technical demo required by submission spec; tracked at repo root (76 MB, under GitHub's 100 MB hard limit). Direct add — no LFS configured in this repo.
- README.md: replace the Video Links demo TODO with a relative link plus a "non-technical (3-5 min)" label so a grader can find it. Technical-walkthrough TODO left for the next pass.
- instructions/self_assessment_alex_free.docx: bump points total 100 → 103 (within the rubric's allowed range).

Co-authored-by: Claude Opus 4.7 (1M context) <noreply@anthropic.com>
</commit_message>
<xml_diff>
--- a/instructions/self_assessment_alex_free.docx
+++ b/instructions/self_assessment_alex_free.docx
@@ -56,12 +56,6 @@
         <w:gridCol w:w="6960"/>
       </w:tblGrid>
       <w:tr>
-        <w:tblPrEx>
-          <w:tblCellMar>
-            <w:top w:w="0" w:type="dxa"/>
-            <w:bottom w:w="0" w:type="dxa"/>
-          </w:tblCellMar>
-        </w:tblPrEx>
         <w:tc>
           <w:tcPr>
             <w:tcW w:w="2400" w:type="dxa"/>
@@ -120,12 +114,6 @@
         </w:tc>
       </w:tr>
       <w:tr>
-        <w:tblPrEx>
-          <w:tblCellMar>
-            <w:top w:w="0" w:type="dxa"/>
-            <w:bottom w:w="0" w:type="dxa"/>
-          </w:tblCellMar>
-        </w:tblPrEx>
         <w:tc>
           <w:tcPr>
             <w:tcW w:w="2400" w:type="dxa"/>
@@ -184,12 +172,6 @@
         </w:tc>
       </w:tr>
       <w:tr>
-        <w:tblPrEx>
-          <w:tblCellMar>
-            <w:top w:w="0" w:type="dxa"/>
-            <w:bottom w:w="0" w:type="dxa"/>
-          </w:tblCellMar>
-        </w:tblPrEx>
         <w:tc>
           <w:tcPr>
             <w:tcW w:w="2400" w:type="dxa"/>
@@ -248,12 +230,6 @@
         </w:tc>
       </w:tr>
       <w:tr>
-        <w:tblPrEx>
-          <w:tblCellMar>
-            <w:top w:w="0" w:type="dxa"/>
-            <w:bottom w:w="0" w:type="dxa"/>
-          </w:tblCellMar>
-        </w:tblPrEx>
         <w:tc>
           <w:tcPr>
             <w:tcW w:w="2400" w:type="dxa"/>
@@ -326,15 +302,7 @@
         <w:spacing w:before="60" w:after="60"/>
       </w:pPr>
       <w:r>
-        <w:t xml:space="preserve">Fill out this template in Word (or Google Docs → download as .docx), then upload the completed .docx to </w:t>
-      </w:r>
-      <w:proofErr w:type="spellStart"/>
-      <w:r>
-        <w:t>Gradescope</w:t>
-      </w:r>
-      <w:proofErr w:type="spellEnd"/>
-      <w:r>
-        <w:t xml:space="preserve"> alongside your repository link. Please do not convert to PDF — the editable .docx format is what </w:t>
+        <w:t xml:space="preserve">Fill out this template in Word (or Google Docs → download as .docx), then upload the completed .docx to Gradescope alongside your repository link. Please do not convert to PDF — the editable .docx format is what </w:t>
       </w:r>
       <w:r>
         <w:t>we</w:t>
@@ -395,13 +363,8 @@
         <w:spacing w:before="40" w:after="40"/>
       </w:pPr>
       <w:r>
-        <w:t>ablation study results in notebooks/</w:t>
+        <w:t>ablation study results in notebooks/experiments.ipynb</w:t>
       </w:r>
-      <w:proofErr w:type="spellStart"/>
-      <w:r>
-        <w:t>experiments.ipynb</w:t>
-      </w:r>
-      <w:proofErr w:type="spellEnd"/>
     </w:p>
     <w:p>
       <w:pPr>
@@ -575,18 +538,12 @@
         <w:tblLook w:val="0000" w:firstRow="0" w:lastRow="0" w:firstColumn="0" w:lastColumn="0" w:noHBand="0" w:noVBand="0"/>
       </w:tblPr>
       <w:tblGrid>
-        <w:gridCol w:w="600"/>
-        <w:gridCol w:w="5000"/>
-        <w:gridCol w:w="900"/>
-        <w:gridCol w:w="2860"/>
+        <w:gridCol w:w="476"/>
+        <w:gridCol w:w="2026"/>
+        <w:gridCol w:w="820"/>
+        <w:gridCol w:w="6038"/>
       </w:tblGrid>
       <w:tr>
-        <w:tblPrEx>
-          <w:tblCellMar>
-            <w:top w:w="0" w:type="dxa"/>
-            <w:bottom w:w="0" w:type="dxa"/>
-          </w:tblCellMar>
-        </w:tblPrEx>
         <w:trPr>
           <w:tblHeader/>
         </w:trPr>
@@ -728,12 +685,6 @@
         </w:tc>
       </w:tr>
       <w:tr>
-        <w:tblPrEx>
-          <w:tblCellMar>
-            <w:top w:w="0" w:type="dxa"/>
-            <w:bottom w:w="0" w:type="dxa"/>
-          </w:tblCellMar>
-        </w:tblPrEx>
         <w:tc>
           <w:tcPr>
             <w:tcW w:w="600" w:type="dxa"/>
@@ -828,12 +779,6 @@
         </w:tc>
       </w:tr>
       <w:tr>
-        <w:tblPrEx>
-          <w:tblCellMar>
-            <w:top w:w="0" w:type="dxa"/>
-            <w:bottom w:w="0" w:type="dxa"/>
-          </w:tblCellMar>
-        </w:tblPrEx>
         <w:tc>
           <w:tcPr>
             <w:tcW w:w="600" w:type="dxa"/>
@@ -928,12 +873,6 @@
         </w:tc>
       </w:tr>
       <w:tr>
-        <w:tblPrEx>
-          <w:tblCellMar>
-            <w:top w:w="0" w:type="dxa"/>
-            <w:bottom w:w="0" w:type="dxa"/>
-          </w:tblCellMar>
-        </w:tblPrEx>
         <w:tc>
           <w:tcPr>
             <w:tcW w:w="600" w:type="dxa"/>
@@ -1028,12 +967,6 @@
         </w:tc>
       </w:tr>
       <w:tr>
-        <w:tblPrEx>
-          <w:tblCellMar>
-            <w:top w:w="0" w:type="dxa"/>
-            <w:bottom w:w="0" w:type="dxa"/>
-          </w:tblCellMar>
-        </w:tblPrEx>
         <w:tc>
           <w:tcPr>
             <w:tcW w:w="600" w:type="dxa"/>
@@ -1128,12 +1061,6 @@
         </w:tc>
       </w:tr>
       <w:tr>
-        <w:tblPrEx>
-          <w:tblCellMar>
-            <w:top w:w="0" w:type="dxa"/>
-            <w:bottom w:w="0" w:type="dxa"/>
-          </w:tblCellMar>
-        </w:tblPrEx>
         <w:tc>
           <w:tcPr>
             <w:tcW w:w="600" w:type="dxa"/>
@@ -1222,18 +1149,16 @@
           </w:tcPr>
           <w:p>
             <w:r>
-              <w:t>Three independent error-analysis surfaces. (a) QB/diagnose_qb_outliers.py — 579-line diagnostic that performs per-target Ridge coefficient attribution and NN integrated gradients (50 interpolation steps) on outlier QBs, with receiving-contamination stats and 8-game player history; output-path declarations at QB/diagnose_qb_outliers.py:16-17,47-48. (b) RB/analyze_rb_errors.py — 165-line stratified-error analyzer (MAE by snap bucket / opp tier / TD bucket / week phase / volatility quintile); figure-write site at RB/analyze_rb_errors.py:138. (c) docs/expert_comparison.md:99-141 — narrative failure-mode analysis ("QB R² limited by TD variance"; "WR NN-vs-Ridge 0.7-pt gap argues non-linearity"; "RB rushing/receiving balance"). The discussion in (c) stands on its own as the failure-case discussion the rubric asks for; (a) and (b) are the analysis machinery. Their outputs land under analysis_output/ (in .gitignore); regeneration commands and what each script produces are documented in instructions/SELF_ASSESSMENT_EVIDENCE.md.</w:t>
+              <w:t xml:space="preserve">Three independent error-analysis surfaces. (a) QB/diagnose_qb_outliers.py — 579-line diagnostic that performs per-target Ridge coefficient attribution and NN integrated gradients (50 interpolation steps) on outlier QBs, with receiving-contamination stats and 8-game player history; output-path declarations at QB/diagnose_qb_outliers.py:16-17,47-48. (b) RB/analyze_rb_errors.py — 165-line stratified-error analyzer (MAE by snap bucket / opp tier / TD bucket / week phase / volatility quintile); figure-write site at RB/analyze_rb_errors.py:138. (c) docs/expert_comparison.md:99-141 — narrative failure-mode analysis ("QB R² limited by TD variance"; "WR NN-vs-Ridge 0.7-pt </w:t>
+            </w:r>
+            <w:r>
+              <w:lastRenderedPageBreak/>
+              <w:t>gap argues non-linearity"; "RB rushing/receiving balance"). The discussion in (c) stands on its own as the failure-case discussion the rubric asks for; (a) and (b) are the analysis machinery. Their outputs land under analysis_output/ (in .gitignore); regeneration commands and what each script produces are documented in instructions/SELF_ASSESSMENT_EVIDENCE.md.</w:t>
             </w:r>
           </w:p>
         </w:tc>
       </w:tr>
       <w:tr>
-        <w:tblPrEx>
-          <w:tblCellMar>
-            <w:top w:w="0" w:type="dxa"/>
-            <w:bottom w:w="0" w:type="dxa"/>
-          </w:tblCellMar>
-        </w:tblPrEx>
         <w:tc>
           <w:tcPr>
             <w:tcW w:w="600" w:type="dxa"/>
@@ -1256,6 +1181,7 @@
               <w:spacing w:before="60" w:after="60"/>
             </w:pPr>
             <w:r>
+              <w:lastRenderedPageBreak/>
               <w:t>6</w:t>
             </w:r>
           </w:p>
@@ -1328,12 +1254,6 @@
         </w:tc>
       </w:tr>
       <w:tr>
-        <w:tblPrEx>
-          <w:tblCellMar>
-            <w:top w:w="0" w:type="dxa"/>
-            <w:bottom w:w="0" w:type="dxa"/>
-          </w:tblCellMar>
-        </w:tblPrEx>
         <w:tc>
           <w:tcPr>
             <w:tcW w:w="600" w:type="dxa"/>
@@ -1428,12 +1348,6 @@
         </w:tc>
       </w:tr>
       <w:tr>
-        <w:tblPrEx>
-          <w:tblCellMar>
-            <w:top w:w="0" w:type="dxa"/>
-            <w:bottom w:w="0" w:type="dxa"/>
-          </w:tblCellMar>
-        </w:tblPrEx>
         <w:tc>
           <w:tcPr>
             <w:tcW w:w="600" w:type="dxa"/>
@@ -1522,18 +1436,16 @@
           </w:tcPr>
           <w:p>
             <w:r>
-              <w:t>Weekly fantasy-point forecasting via rolling/EWMA/trend features + temporal split + attention pool over up to 17-game history sequences. src/features/engineer.py builds 155 derived columns (instructions/DESIGN_DOC.md:481-499 enumerates them); src/data/split.py:6-37 implements the season-based temporal split; shared/neural_net.py:202+ implements MultiHeadNetWithHistory and MultiHeadNetWithNestedHistory; design rationale at docs/ARCHITECTURE.md:177-201 (D4).</w:t>
+              <w:t xml:space="preserve">Weekly fantasy-point forecasting via rolling/EWMA/trend features + temporal split + attention pool over up to 17-game history sequences. src/features/engineer.py builds 155 derived columns (instructions/DESIGN_DOC.md:481-499 enumerates them); src/data/split.py:6-37 implements the season-based temporal split; shared/neural_net.py:202+ implements MultiHeadNetWithHistory and </w:t>
+            </w:r>
+            <w:r>
+              <w:lastRenderedPageBreak/>
+              <w:t>MultiHeadNetWithNestedHistory; design rationale at docs/ARCHITECTURE.md:177-201 (D4).</w:t>
             </w:r>
           </w:p>
         </w:tc>
       </w:tr>
       <w:tr>
-        <w:tblPrEx>
-          <w:tblCellMar>
-            <w:top w:w="0" w:type="dxa"/>
-            <w:bottom w:w="0" w:type="dxa"/>
-          </w:tblCellMar>
-        </w:tblPrEx>
         <w:tc>
           <w:tcPr>
             <w:tcW w:w="600" w:type="dxa"/>
@@ -1556,6 +1468,7 @@
               <w:spacing w:before="60" w:after="60"/>
             </w:pPr>
             <w:r>
+              <w:lastRenderedPageBreak/>
               <w:t>9</w:t>
             </w:r>
           </w:p>
@@ -1628,12 +1541,6 @@
         </w:tc>
       </w:tr>
       <w:tr>
-        <w:tblPrEx>
-          <w:tblCellMar>
-            <w:top w:w="0" w:type="dxa"/>
-            <w:bottom w:w="0" w:type="dxa"/>
-          </w:tblCellMar>
-        </w:tblPrEx>
         <w:tc>
           <w:tcPr>
             <w:tcW w:w="600" w:type="dxa"/>
@@ -1728,12 +1635,6 @@
         </w:tc>
       </w:tr>
       <w:tr>
-        <w:tblPrEx>
-          <w:tblCellMar>
-            <w:top w:w="0" w:type="dxa"/>
-            <w:bottom w:w="0" w:type="dxa"/>
-          </w:tblCellMar>
-        </w:tblPrEx>
         <w:tc>
           <w:tcPr>
             <w:tcW w:w="600" w:type="dxa"/>
@@ -1828,12 +1729,6 @@
         </w:tc>
       </w:tr>
       <w:tr>
-        <w:tblPrEx>
-          <w:tblCellMar>
-            <w:top w:w="0" w:type="dxa"/>
-            <w:bottom w:w="0" w:type="dxa"/>
-          </w:tblCellMar>
-        </w:tblPrEx>
         <w:tc>
           <w:tcPr>
             <w:tcW w:w="600" w:type="dxa"/>
@@ -1878,7 +1773,11 @@
           </w:tcPr>
           <w:p>
             <w:r>
-              <w:t>≥2 documented iterations of improvement from evaluation (what tried, measured, changed, improvement shown)  ⭐ EVIDENCE OF IMPACT</w:t>
+              <w:t xml:space="preserve">≥2 documented iterations of improvement from evaluation (what tried, measured, </w:t>
+            </w:r>
+            <w:r>
+              <w:lastRenderedPageBreak/>
+              <w:t>changed, improvement shown)  ⭐ EVIDENCE OF IMPACT</w:t>
             </w:r>
           </w:p>
         </w:tc>
@@ -1900,6 +1799,7 @@
           </w:tcPr>
           <w:p>
             <w:r>
+              <w:lastRenderedPageBreak/>
               <w:t>5</w:t>
             </w:r>
           </w:p>
@@ -1922,18 +1822,16 @@
           </w:tcPr>
           <w:p>
             <w:r>
-              <w:t>TODO.md "Fixed" archive (lines 43-150) is purpose-built for this rubric item — ~17 entries each structured What → Files → Fix → Lesson, multiple with explicit before/after numbers: total-aux-loss double-count eliminated ~1.9 pt/game QB systematic bias (TODO.md:59-63); softplus floor restored Ridge-NN scale parity, allowing exact-zero predictions (TODO.md:65-71); ±4σ feature clipping stabilized OOD test predictions (TODO.md:73-77); Huber-δ asymmetry rebalance recovered count heads (TODO.md:146-150). Each entry's Lesson line distills the learning.</w:t>
+              <w:t xml:space="preserve">TODO.md "Fixed" archive (lines 43-150) is purpose-built for this rubric item — ~17 entries each structured What → Files → Fix → Lesson, multiple with explicit before/after numbers: total-aux-loss double-count eliminated ~1.9 pt/game QB systematic bias (TODO.md:59-63); softplus floor restored Ridge-NN scale parity, </w:t>
+            </w:r>
+            <w:r>
+              <w:lastRenderedPageBreak/>
+              <w:t>allowing exact-zero predictions (TODO.md:65-71); ±4σ feature clipping stabilized OOD test predictions (TODO.md:73-77); Huber-δ asymmetry rebalance recovered count heads (TODO.md:146-150). Each entry's Lesson line distills the learning.</w:t>
             </w:r>
           </w:p>
         </w:tc>
       </w:tr>
       <w:tr>
-        <w:tblPrEx>
-          <w:tblCellMar>
-            <w:top w:w="0" w:type="dxa"/>
-            <w:bottom w:w="0" w:type="dxa"/>
-          </w:tblCellMar>
-        </w:tblPrEx>
         <w:tc>
           <w:tcPr>
             <w:tcW w:w="600" w:type="dxa"/>
@@ -1956,6 +1854,7 @@
               <w:spacing w:before="60" w:after="60"/>
             </w:pPr>
             <w:r>
+              <w:lastRenderedPageBreak/>
               <w:t>13</w:t>
             </w:r>
           </w:p>
@@ -2028,12 +1927,6 @@
         </w:tc>
       </w:tr>
       <w:tr>
-        <w:tblPrEx>
-          <w:tblCellMar>
-            <w:top w:w="0" w:type="dxa"/>
-            <w:bottom w:w="0" w:type="dxa"/>
-          </w:tblCellMar>
-        </w:tblPrEx>
         <w:tc>
           <w:tcPr>
             <w:tcW w:w="600" w:type="dxa"/>
@@ -2128,12 +2021,6 @@
         </w:tc>
       </w:tr>
       <w:tr>
-        <w:tblPrEx>
-          <w:tblCellMar>
-            <w:top w:w="0" w:type="dxa"/>
-            <w:bottom w:w="0" w:type="dxa"/>
-          </w:tblCellMar>
-        </w:tblPrEx>
         <w:tc>
           <w:tcPr>
             <w:tcW w:w="600" w:type="dxa"/>
@@ -2251,6 +2138,7 @@
         <w:spacing w:before="240" w:after="120"/>
       </w:pPr>
       <w:r>
+        <w:lastRenderedPageBreak/>
         <w:t>Submission and Self-Assessment</w:t>
       </w:r>
     </w:p>
@@ -2277,12 +2165,6 @@
         <w:gridCol w:w="4600"/>
       </w:tblGrid>
       <w:tr>
-        <w:tblPrEx>
-          <w:tblCellMar>
-            <w:top w:w="0" w:type="dxa"/>
-            <w:bottom w:w="0" w:type="dxa"/>
-          </w:tblCellMar>
-        </w:tblPrEx>
         <w:trPr>
           <w:tblHeader/>
         </w:trPr>
@@ -2316,7 +2198,6 @@
                 <w:b/>
                 <w:bCs/>
               </w:rPr>
-              <w:lastRenderedPageBreak/>
               <w:t>Claim</w:t>
             </w:r>
           </w:p>
@@ -2391,12 +2272,6 @@
         </w:tc>
       </w:tr>
       <w:tr>
-        <w:tblPrEx>
-          <w:tblCellMar>
-            <w:top w:w="0" w:type="dxa"/>
-            <w:bottom w:w="0" w:type="dxa"/>
-          </w:tblCellMar>
-        </w:tblPrEx>
         <w:tc>
           <w:tcPr>
             <w:tcW w:w="800" w:type="dxa"/>
@@ -2516,12 +2391,6 @@
         <w:gridCol w:w="4600"/>
       </w:tblGrid>
       <w:tr>
-        <w:tblPrEx>
-          <w:tblCellMar>
-            <w:top w:w="0" w:type="dxa"/>
-            <w:bottom w:w="0" w:type="dxa"/>
-          </w:tblCellMar>
-        </w:tblPrEx>
         <w:trPr>
           <w:tblHeader/>
         </w:trPr>
@@ -2629,12 +2498,6 @@
         </w:tc>
       </w:tr>
       <w:tr>
-        <w:tblPrEx>
-          <w:tblCellMar>
-            <w:top w:w="0" w:type="dxa"/>
-            <w:bottom w:w="0" w:type="dxa"/>
-          </w:tblCellMar>
-        </w:tblPrEx>
         <w:tc>
           <w:tcPr>
             <w:tcW w:w="800" w:type="dxa"/>
@@ -2722,12 +2585,6 @@
         </w:tc>
       </w:tr>
       <w:tr>
-        <w:tblPrEx>
-          <w:tblCellMar>
-            <w:top w:w="0" w:type="dxa"/>
-            <w:bottom w:w="0" w:type="dxa"/>
-          </w:tblCellMar>
-        </w:tblPrEx>
         <w:tc>
           <w:tcPr>
             <w:tcW w:w="800" w:type="dxa"/>
@@ -2815,12 +2672,6 @@
         </w:tc>
       </w:tr>
       <w:tr>
-        <w:tblPrEx>
-          <w:tblCellMar>
-            <w:top w:w="0" w:type="dxa"/>
-            <w:bottom w:w="0" w:type="dxa"/>
-          </w:tblCellMar>
-        </w:tblPrEx>
         <w:tc>
           <w:tcPr>
             <w:tcW w:w="800" w:type="dxa"/>
@@ -2902,26 +2753,12 @@
               <w:spacing w:before="60" w:after="60"/>
             </w:pPr>
             <w:r>
-              <w:t xml:space="preserve">requirements.txt or </w:t>
-            </w:r>
-            <w:proofErr w:type="spellStart"/>
-            <w:r>
-              <w:t>environment.yml</w:t>
-            </w:r>
-            <w:proofErr w:type="spellEnd"/>
-            <w:r>
-              <w:t xml:space="preserve"> present and accurate</w:t>
+              <w:t>requirements.txt or environment.yml present and accurate</w:t>
             </w:r>
           </w:p>
         </w:tc>
       </w:tr>
       <w:tr>
-        <w:tblPrEx>
-          <w:tblCellMar>
-            <w:top w:w="0" w:type="dxa"/>
-            <w:bottom w:w="0" w:type="dxa"/>
-          </w:tblCellMar>
-        </w:tblPrEx>
         <w:tc>
           <w:tcPr>
             <w:tcW w:w="800" w:type="dxa"/>
@@ -3009,12 +2846,6 @@
         </w:tc>
       </w:tr>
       <w:tr>
-        <w:tblPrEx>
-          <w:tblCellMar>
-            <w:top w:w="0" w:type="dxa"/>
-            <w:bottom w:w="0" w:type="dxa"/>
-          </w:tblCellMar>
-        </w:tblPrEx>
         <w:tc>
           <w:tcPr>
             <w:tcW w:w="800" w:type="dxa"/>
@@ -3102,12 +2933,6 @@
         </w:tc>
       </w:tr>
       <w:tr>
-        <w:tblPrEx>
-          <w:tblCellMar>
-            <w:top w:w="0" w:type="dxa"/>
-            <w:bottom w:w="0" w:type="dxa"/>
-          </w:tblCellMar>
-        </w:tblPrEx>
         <w:tc>
           <w:tcPr>
             <w:tcW w:w="800" w:type="dxa"/>
@@ -3195,12 +3020,6 @@
         </w:tc>
       </w:tr>
       <w:tr>
-        <w:tblPrEx>
-          <w:tblCellMar>
-            <w:top w:w="0" w:type="dxa"/>
-            <w:bottom w:w="0" w:type="dxa"/>
-          </w:tblCellMar>
-        </w:tblPrEx>
         <w:tc>
           <w:tcPr>
             <w:tcW w:w="800" w:type="dxa"/>
@@ -3288,12 +3107,6 @@
         </w:tc>
       </w:tr>
       <w:tr>
-        <w:tblPrEx>
-          <w:tblCellMar>
-            <w:top w:w="0" w:type="dxa"/>
-            <w:bottom w:w="0" w:type="dxa"/>
-          </w:tblCellMar>
-        </w:tblPrEx>
         <w:tc>
           <w:tcPr>
             <w:tcW w:w="800" w:type="dxa"/>
@@ -3413,12 +3226,6 @@
         <w:gridCol w:w="4600"/>
       </w:tblGrid>
       <w:tr>
-        <w:tblPrEx>
-          <w:tblCellMar>
-            <w:top w:w="0" w:type="dxa"/>
-            <w:bottom w:w="0" w:type="dxa"/>
-          </w:tblCellMar>
-        </w:tblPrEx>
         <w:trPr>
           <w:tblHeader/>
         </w:trPr>
@@ -3526,12 +3333,6 @@
         </w:tc>
       </w:tr>
       <w:tr>
-        <w:tblPrEx>
-          <w:tblCellMar>
-            <w:top w:w="0" w:type="dxa"/>
-            <w:bottom w:w="0" w:type="dxa"/>
-          </w:tblCellMar>
-        </w:tblPrEx>
         <w:tc>
           <w:tcPr>
             <w:tcW w:w="800" w:type="dxa"/>
@@ -3619,12 +3420,6 @@
         </w:tc>
       </w:tr>
       <w:tr>
-        <w:tblPrEx>
-          <w:tblCellMar>
-            <w:top w:w="0" w:type="dxa"/>
-            <w:bottom w:w="0" w:type="dxa"/>
-          </w:tblCellMar>
-        </w:tblPrEx>
         <w:tc>
           <w:tcPr>
             <w:tcW w:w="800" w:type="dxa"/>
@@ -3718,6 +3513,7 @@
         <w:spacing w:before="240" w:after="120"/>
       </w:pPr>
       <w:r>
+        <w:lastRenderedPageBreak/>
         <w:t>Project Workshop Days (1 pt each)</w:t>
       </w:r>
     </w:p>
@@ -3744,12 +3540,6 @@
         <w:gridCol w:w="4600"/>
       </w:tblGrid>
       <w:tr>
-        <w:tblPrEx>
-          <w:tblCellMar>
-            <w:top w:w="0" w:type="dxa"/>
-            <w:bottom w:w="0" w:type="dxa"/>
-          </w:tblCellMar>
-        </w:tblPrEx>
         <w:trPr>
           <w:tblHeader/>
         </w:trPr>
@@ -3783,7 +3573,6 @@
                 <w:b/>
                 <w:bCs/>
               </w:rPr>
-              <w:lastRenderedPageBreak/>
               <w:t>Claim</w:t>
             </w:r>
           </w:p>
@@ -3858,12 +3647,6 @@
         </w:tc>
       </w:tr>
       <w:tr>
-        <w:tblPrEx>
-          <w:tblCellMar>
-            <w:top w:w="0" w:type="dxa"/>
-            <w:bottom w:w="0" w:type="dxa"/>
-          </w:tblCellMar>
-        </w:tblPrEx>
         <w:tc>
           <w:tcPr>
             <w:tcW w:w="800" w:type="dxa"/>
@@ -3951,12 +3734,6 @@
         </w:tc>
       </w:tr>
       <w:tr>
-        <w:tblPrEx>
-          <w:tblCellMar>
-            <w:top w:w="0" w:type="dxa"/>
-            <w:bottom w:w="0" w:type="dxa"/>
-          </w:tblCellMar>
-        </w:tblPrEx>
         <w:tc>
           <w:tcPr>
             <w:tcW w:w="800" w:type="dxa"/>
@@ -4044,12 +3821,6 @@
         </w:tc>
       </w:tr>
       <w:tr>
-        <w:tblPrEx>
-          <w:tblCellMar>
-            <w:top w:w="0" w:type="dxa"/>
-            <w:bottom w:w="0" w:type="dxa"/>
-          </w:tblCellMar>
-        </w:tblPrEx>
         <w:tc>
           <w:tcPr>
             <w:tcW w:w="800" w:type="dxa"/>
@@ -4137,12 +3908,6 @@
         </w:tc>
       </w:tr>
       <w:tr>
-        <w:tblPrEx>
-          <w:tblCellMar>
-            <w:top w:w="0" w:type="dxa"/>
-            <w:bottom w:w="0" w:type="dxa"/>
-          </w:tblCellMar>
-        </w:tblPrEx>
         <w:tc>
           <w:tcPr>
             <w:tcW w:w="800" w:type="dxa"/>
@@ -4279,12 +4044,6 @@
         <w:gridCol w:w="4600"/>
       </w:tblGrid>
       <w:tr>
-        <w:tblPrEx>
-          <w:tblCellMar>
-            <w:top w:w="0" w:type="dxa"/>
-            <w:bottom w:w="0" w:type="dxa"/>
-          </w:tblCellMar>
-        </w:tblPrEx>
         <w:trPr>
           <w:tblHeader/>
         </w:trPr>
@@ -4392,12 +4151,6 @@
         </w:tc>
       </w:tr>
       <w:tr>
-        <w:tblPrEx>
-          <w:tblCellMar>
-            <w:top w:w="0" w:type="dxa"/>
-            <w:bottom w:w="0" w:type="dxa"/>
-          </w:tblCellMar>
-        </w:tblPrEx>
         <w:tc>
           <w:tcPr>
             <w:tcW w:w="800" w:type="dxa"/>
@@ -4485,12 +4238,6 @@
         </w:tc>
       </w:tr>
       <w:tr>
-        <w:tblPrEx>
-          <w:tblCellMar>
-            <w:top w:w="0" w:type="dxa"/>
-            <w:bottom w:w="0" w:type="dxa"/>
-          </w:tblCellMar>
-        </w:tblPrEx>
         <w:tc>
           <w:tcPr>
             <w:tcW w:w="800" w:type="dxa"/>
@@ -4578,12 +4325,6 @@
         </w:tc>
       </w:tr>
       <w:tr>
-        <w:tblPrEx>
-          <w:tblCellMar>
-            <w:top w:w="0" w:type="dxa"/>
-            <w:bottom w:w="0" w:type="dxa"/>
-          </w:tblCellMar>
-        </w:tblPrEx>
         <w:tc>
           <w:tcPr>
             <w:tcW w:w="800" w:type="dxa"/>
@@ -4703,12 +4444,6 @@
         <w:gridCol w:w="4600"/>
       </w:tblGrid>
       <w:tr>
-        <w:tblPrEx>
-          <w:tblCellMar>
-            <w:top w:w="0" w:type="dxa"/>
-            <w:bottom w:w="0" w:type="dxa"/>
-          </w:tblCellMar>
-        </w:tblPrEx>
         <w:trPr>
           <w:tblHeader/>
         </w:trPr>
@@ -4816,12 +4551,6 @@
         </w:tc>
       </w:tr>
       <w:tr>
-        <w:tblPrEx>
-          <w:tblCellMar>
-            <w:top w:w="0" w:type="dxa"/>
-            <w:bottom w:w="0" w:type="dxa"/>
-          </w:tblCellMar>
-        </w:tblPrEx>
         <w:tc>
           <w:tcPr>
             <w:tcW w:w="800" w:type="dxa"/>
@@ -4909,12 +4638,6 @@
         </w:tc>
       </w:tr>
       <w:tr>
-        <w:tblPrEx>
-          <w:tblCellMar>
-            <w:top w:w="0" w:type="dxa"/>
-            <w:bottom w:w="0" w:type="dxa"/>
-          </w:tblCellMar>
-        </w:tblPrEx>
         <w:tc>
           <w:tcPr>
             <w:tcW w:w="800" w:type="dxa"/>
@@ -5002,12 +4725,6 @@
         </w:tc>
       </w:tr>
       <w:tr>
-        <w:tblPrEx>
-          <w:tblCellMar>
-            <w:top w:w="0" w:type="dxa"/>
-            <w:bottom w:w="0" w:type="dxa"/>
-          </w:tblCellMar>
-        </w:tblPrEx>
         <w:tc>
           <w:tcPr>
             <w:tcW w:w="800" w:type="dxa"/>
@@ -5095,12 +4812,6 @@
         </w:tc>
       </w:tr>
       <w:tr>
-        <w:tblPrEx>
-          <w:tblCellMar>
-            <w:top w:w="0" w:type="dxa"/>
-            <w:bottom w:w="0" w:type="dxa"/>
-          </w:tblCellMar>
-        </w:tblPrEx>
         <w:tc>
           <w:tcPr>
             <w:tcW w:w="800" w:type="dxa"/>
@@ -5131,6 +4842,7 @@
                 <w:sz w:val="28"/>
                 <w:szCs w:val="28"/>
               </w:rPr>
+              <w:lastRenderedPageBreak/>
               <w:t>☒</w:t>
             </w:r>
           </w:p>
@@ -5188,12 +4900,6 @@
         </w:tc>
       </w:tr>
       <w:tr>
-        <w:tblPrEx>
-          <w:tblCellMar>
-            <w:top w:w="0" w:type="dxa"/>
-            <w:bottom w:w="0" w:type="dxa"/>
-          </w:tblCellMar>
-        </w:tblPrEx>
         <w:tc>
           <w:tcPr>
             <w:tcW w:w="800" w:type="dxa"/>
@@ -5281,12 +4987,6 @@
         </w:tc>
       </w:tr>
       <w:tr>
-        <w:tblPrEx>
-          <w:tblCellMar>
-            <w:top w:w="0" w:type="dxa"/>
-            <w:bottom w:w="0" w:type="dxa"/>
-          </w:tblCellMar>
-        </w:tblPrEx>
         <w:tc>
           <w:tcPr>
             <w:tcW w:w="800" w:type="dxa"/>
@@ -5405,12 +5105,6 @@
         <w:gridCol w:w="1440"/>
       </w:tblGrid>
       <w:tr>
-        <w:tblPrEx>
-          <w:tblCellMar>
-            <w:top w:w="0" w:type="dxa"/>
-            <w:bottom w:w="0" w:type="dxa"/>
-          </w:tblCellMar>
-        </w:tblPrEx>
         <w:trPr>
           <w:tblHeader/>
         </w:trPr>
@@ -5485,12 +5179,6 @@
         </w:tc>
       </w:tr>
       <w:tr>
-        <w:tblPrEx>
-          <w:tblCellMar>
-            <w:top w:w="0" w:type="dxa"/>
-            <w:bottom w:w="0" w:type="dxa"/>
-          </w:tblCellMar>
-        </w:tblPrEx>
         <w:tc>
           <w:tcPr>
             <w:tcW w:w="3456" w:type="dxa"/>
@@ -5545,12 +5233,6 @@
         </w:tc>
       </w:tr>
       <w:tr>
-        <w:tblPrEx>
-          <w:tblCellMar>
-            <w:top w:w="0" w:type="dxa"/>
-            <w:bottom w:w="0" w:type="dxa"/>
-          </w:tblCellMar>
-        </w:tblPrEx>
         <w:tc>
           <w:tcPr>
             <w:tcW w:w="3456" w:type="dxa"/>
@@ -5605,12 +5287,6 @@
         </w:tc>
       </w:tr>
       <w:tr>
-        <w:tblPrEx>
-          <w:tblCellMar>
-            <w:top w:w="0" w:type="dxa"/>
-            <w:bottom w:w="0" w:type="dxa"/>
-          </w:tblCellMar>
-        </w:tblPrEx>
         <w:tc>
           <w:tcPr>
             <w:tcW w:w="3456" w:type="dxa"/>
@@ -5665,12 +5341,6 @@
         </w:tc>
       </w:tr>
       <w:tr>
-        <w:tblPrEx>
-          <w:tblCellMar>
-            <w:top w:w="0" w:type="dxa"/>
-            <w:bottom w:w="0" w:type="dxa"/>
-          </w:tblCellMar>
-        </w:tblPrEx>
         <w:tc>
           <w:tcPr>
             <w:tcW w:w="3456" w:type="dxa"/>
@@ -5720,7 +5390,16 @@
               <w:jc w:val="right"/>
             </w:pPr>
             <w:r>
-              <w:t>100 / 100</w:t>
+              <w:t>10</w:t>
+            </w:r>
+            <w:r>
+              <w:t>3</w:t>
+            </w:r>
+            <w:r>
+              <w:t xml:space="preserve"> / 10</w:t>
+            </w:r>
+            <w:r>
+              <w:t>0</w:t>
             </w:r>
           </w:p>
         </w:tc>
@@ -5776,12 +5455,6 @@
         <w:gridCol w:w="9360"/>
       </w:tblGrid>
       <w:tr>
-        <w:tblPrEx>
-          <w:tblCellMar>
-            <w:top w:w="0" w:type="dxa"/>
-            <w:bottom w:w="0" w:type="dxa"/>
-          </w:tblCellMar>
-        </w:tblPrEx>
         <w:tc>
           <w:tcPr>
             <w:tcW w:w="9360" w:type="dxa"/>
@@ -5839,12 +5512,6 @@
         <w:gridCol w:w="9360"/>
       </w:tblGrid>
       <w:tr>
-        <w:tblPrEx>
-          <w:tblCellMar>
-            <w:top w:w="0" w:type="dxa"/>
-            <w:bottom w:w="0" w:type="dxa"/>
-          </w:tblCellMar>
-        </w:tblPrEx>
         <w:tc>
           <w:tcPr>
             <w:tcW w:w="9360" w:type="dxa"/>
@@ -5902,12 +5569,6 @@
         <w:gridCol w:w="9360"/>
       </w:tblGrid>
       <w:tr>
-        <w:tblPrEx>
-          <w:tblCellMar>
-            <w:top w:w="0" w:type="dxa"/>
-            <w:bottom w:w="0" w:type="dxa"/>
-          </w:tblCellMar>
-        </w:tblPrEx>
         <w:tc>
           <w:tcPr>
             <w:tcW w:w="9360" w:type="dxa"/>
@@ -5926,6 +5587,7 @@
           </w:tcPr>
           <w:p>
             <w:r>
+              <w:lastRenderedPageBreak/>
               <w:t>Three things, in priority order: (1) train per-scoring-format models so MAE doesn't have to be reported PPR-only (the aggregator handles it at serving but the models themselves are PPR-trained); (2) lineup-construction layer so projections become a usable DFS product, not just per-player point estimates; (3) revisit K's cross-season rolling windows (TODO.md "Open") — currently justified by kicker stability but worth re-measuring once the 2025 season fully closes out.</w:t>
             </w:r>
           </w:p>

</xml_diff>